<commit_message>
Adicionei configurações de VLAN, segurança e RSTP nos switches
</commit_message>
<xml_diff>
--- a/DOCUMENTO_PROJETO/TS - Projeto REDES II.docx
+++ b/DOCUMENTO_PROJETO/TS - Projeto REDES II.docx
@@ -37,12 +37,12 @@
           <wp:inline distB="114300" distT="114300" distL="114300" distR="114300">
             <wp:extent cx="6120000" cy="2463800"/>
             <wp:effectExtent b="0" l="0" r="0" t="0"/>
-            <wp:docPr id="1" name="image1.png"/>
+            <wp:docPr id="2" name="image2.png"/>
             <a:graphic>
               <a:graphicData uri="http://schemas.openxmlformats.org/drawingml/2006/picture">
                 <pic:pic>
                   <pic:nvPicPr>
-                    <pic:cNvPr id="0" name="image1.png"/>
+                    <pic:cNvPr id="0" name="image2.png"/>
                     <pic:cNvPicPr preferRelativeResize="0"/>
                   </pic:nvPicPr>
                   <pic:blipFill>
@@ -1118,6 +1118,76 @@
                 <w:rtl w:val="0"/>
               </w:rPr>
               <w:t xml:space="preserve">40</w:t>
+            </w:r>
+          </w:p>
+        </w:tc>
+      </w:tr>
+      <w:tr>
+        <w:trPr>
+          <w:cantSplit w:val="0"/>
+          <w:tblHeader w:val="0"/>
+        </w:trPr>
+        <w:tc>
+          <w:tcPr>
+            <w:shd w:fill="auto" w:val="clear"/>
+            <w:tcMar>
+              <w:top w:w="100.0" w:type="dxa"/>
+              <w:left w:w="100.0" w:type="dxa"/>
+              <w:bottom w:w="100.0" w:type="dxa"/>
+              <w:right w:w="100.0" w:type="dxa"/>
+            </w:tcMar>
+            <w:vAlign w:val="top"/>
+          </w:tcPr>
+          <w:p>
+            <w:pPr>
+              <w:widowControl w:val="0"/>
+              <w:spacing w:line="240" w:lineRule="auto"/>
+              <w:jc w:val="both"/>
+              <w:rPr/>
+            </w:pPr>
+            <w:r>
+              <w:rPr>
+                <w:rtl w:val="0"/>
+              </w:rPr>
+              <w:t xml:space="preserve">Nativa</w:t>
+            </w:r>
+          </w:p>
+        </w:tc>
+        <w:tc>
+          <w:tcPr>
+            <w:shd w:fill="auto" w:val="clear"/>
+            <w:tcMar>
+              <w:top w:w="100.0" w:type="dxa"/>
+              <w:left w:w="100.0" w:type="dxa"/>
+              <w:bottom w:w="100.0" w:type="dxa"/>
+              <w:right w:w="100.0" w:type="dxa"/>
+            </w:tcMar>
+            <w:vAlign w:val="top"/>
+          </w:tcPr>
+          <w:p>
+            <w:pPr>
+              <w:keepNext w:val="0"/>
+              <w:keepLines w:val="0"/>
+              <w:pageBreakBefore w:val="0"/>
+              <w:widowControl w:val="0"/>
+              <w:pBdr>
+                <w:top w:space="0" w:sz="0" w:val="nil"/>
+                <w:left w:space="0" w:sz="0" w:val="nil"/>
+                <w:bottom w:space="0" w:sz="0" w:val="nil"/>
+                <w:right w:space="0" w:sz="0" w:val="nil"/>
+                <w:between w:space="0" w:sz="0" w:val="nil"/>
+              </w:pBdr>
+              <w:shd w:fill="auto" w:val="clear"/>
+              <w:spacing w:after="0" w:before="0" w:line="240" w:lineRule="auto"/>
+              <w:ind w:left="0" w:right="0" w:firstLine="0"/>
+              <w:jc w:val="both"/>
+              <w:rPr/>
+            </w:pPr>
+            <w:r>
+              <w:rPr>
+                <w:rtl w:val="0"/>
+              </w:rPr>
+              <w:t xml:space="preserve">58</w:t>
             </w:r>
           </w:p>
         </w:tc>
@@ -6985,6 +7055,1349 @@
           <w:rtl w:val="0"/>
         </w:rPr>
         <w:t xml:space="preserve">Para evitar ataques de saltos de VLAN (VLAN Hopping), as negociações do protocolo DTP foram desabilitadas nas portas de acesso e de trunking, além de alterar manualmente a VLAN nativa para um identificador diferente do padrão do dispositivo (VLAN 1). De maneira complementar, foram ativados os recursos de DHCP Snooping e a Inspeção dinâmica de ARP (DAI) para evitar ataques de privação ou spoofing de DHCP e o envenenamento de tabelas ARP, para isso, foi preciso definir as portas de uplink conectadas a outro switch ou roteadores como confiáveis (trusted) e as interfaces de usuário como não confiável (untrusted). Portanto, para resguardar a estabilidade do RSTP, foi configurado o recurso de PortFast (a definição de interfaces como Edge Ports) de forma associada ao BPDU Guard em todas as portas de acesso, uma maneira de garantir que qualquer tentativa de conexão de um switch clandestino nessas interfaces selecionadas resultará no bloqueio imediato (error-disabled) da porta e, assim, preservar a integridade da rede.  </w:t>
+      </w:r>
+    </w:p>
+    <w:p>
+      <w:pPr>
+        <w:ind w:firstLine="720"/>
+        <w:jc w:val="both"/>
+        <w:rPr/>
+      </w:pPr>
+      <w:r>
+        <w:rPr>
+          <w:rtl w:val="0"/>
+        </w:rPr>
+      </w:r>
+    </w:p>
+    <w:p>
+      <w:pPr>
+        <w:ind w:left="0" w:firstLine="0"/>
+        <w:jc w:val="both"/>
+        <w:rPr/>
+      </w:pPr>
+      <w:r>
+        <w:rPr>
+          <w:rtl w:val="0"/>
+        </w:rPr>
+      </w:r>
+    </w:p>
+    <w:p>
+      <w:pPr>
+        <w:ind w:left="0" w:firstLine="0"/>
+        <w:jc w:val="both"/>
+        <w:rPr/>
+      </w:pPr>
+      <w:r>
+        <w:rPr>
+          <w:rtl w:val="0"/>
+        </w:rPr>
+      </w:r>
+    </w:p>
+    <w:p>
+      <w:pPr>
+        <w:ind w:left="0" w:firstLine="0"/>
+        <w:jc w:val="both"/>
+        <w:rPr/>
+      </w:pPr>
+      <w:r>
+        <w:rPr>
+          <w:rtl w:val="0"/>
+        </w:rPr>
+      </w:r>
+    </w:p>
+    <w:p>
+      <w:pPr>
+        <w:ind w:left="0" w:firstLine="0"/>
+        <w:jc w:val="both"/>
+        <w:rPr/>
+      </w:pPr>
+      <w:r>
+        <w:rPr>
+          <w:rtl w:val="0"/>
+        </w:rPr>
+      </w:r>
+    </w:p>
+    <w:p>
+      <w:pPr>
+        <w:ind w:left="0" w:firstLine="0"/>
+        <w:jc w:val="both"/>
+        <w:rPr/>
+      </w:pPr>
+      <w:r>
+        <w:rPr>
+          <w:rtl w:val="0"/>
+        </w:rPr>
+      </w:r>
+    </w:p>
+    <w:p>
+      <w:pPr>
+        <w:ind w:left="0" w:firstLine="0"/>
+        <w:jc w:val="both"/>
+        <w:rPr/>
+      </w:pPr>
+      <w:r>
+        <w:rPr>
+          <w:rtl w:val="0"/>
+        </w:rPr>
+      </w:r>
+    </w:p>
+    <w:p>
+      <w:pPr>
+        <w:ind w:left="0" w:firstLine="0"/>
+        <w:jc w:val="both"/>
+        <w:rPr/>
+      </w:pPr>
+      <w:r>
+        <w:rPr>
+          <w:rtl w:val="0"/>
+        </w:rPr>
+      </w:r>
+    </w:p>
+    <w:p>
+      <w:pPr>
+        <w:ind w:left="0" w:firstLine="0"/>
+        <w:jc w:val="both"/>
+        <w:rPr/>
+      </w:pPr>
+      <w:r>
+        <w:rPr>
+          <w:rtl w:val="0"/>
+        </w:rPr>
+        <w:t xml:space="preserve">Alteração de conexões físicas para criar redundâncias propositais</w:t>
+      </w:r>
+    </w:p>
+    <w:p>
+      <w:pPr>
+        <w:ind w:left="0" w:firstLine="0"/>
+        <w:jc w:val="both"/>
+        <w:rPr/>
+      </w:pPr>
+      <w:r>
+        <w:rPr>
+          <w:rtl w:val="0"/>
+        </w:rPr>
+      </w:r>
+    </w:p>
+    <w:p>
+      <w:pPr>
+        <w:ind w:left="0" w:firstLine="0"/>
+        <w:jc w:val="both"/>
+        <w:rPr/>
+      </w:pPr>
+      <w:r>
+        <w:rPr/>
+        <w:drawing>
+          <wp:inline distB="114300" distT="114300" distL="114300" distR="114300">
+            <wp:extent cx="6120000" cy="2755900"/>
+            <wp:effectExtent b="0" l="0" r="0" t="0"/>
+            <wp:docPr id="1" name="image1.png"/>
+            <a:graphic>
+              <a:graphicData uri="http://schemas.openxmlformats.org/drawingml/2006/picture">
+                <pic:pic>
+                  <pic:nvPicPr>
+                    <pic:cNvPr id="0" name="image1.png"/>
+                    <pic:cNvPicPr preferRelativeResize="0"/>
+                  </pic:nvPicPr>
+                  <pic:blipFill>
+                    <a:blip r:embed="rId7"/>
+                    <a:srcRect b="0" l="0" r="0" t="0"/>
+                    <a:stretch>
+                      <a:fillRect/>
+                    </a:stretch>
+                  </pic:blipFill>
+                  <pic:spPr>
+                    <a:xfrm>
+                      <a:off x="0" y="0"/>
+                      <a:ext cx="6120000" cy="2755900"/>
+                    </a:xfrm>
+                    <a:prstGeom prst="rect"/>
+                    <a:ln/>
+                  </pic:spPr>
+                </pic:pic>
+              </a:graphicData>
+            </a:graphic>
+          </wp:inline>
+        </w:drawing>
+      </w:r>
+      <w:r>
+        <w:rPr>
+          <w:rtl w:val="0"/>
+        </w:rPr>
+      </w:r>
+    </w:p>
+    <w:p>
+      <w:pPr>
+        <w:ind w:left="0" w:firstLine="0"/>
+        <w:jc w:val="both"/>
+        <w:rPr/>
+      </w:pPr>
+      <w:r>
+        <w:rPr>
+          <w:rtl w:val="0"/>
+        </w:rPr>
+      </w:r>
+    </w:p>
+    <w:p>
+      <w:pPr>
+        <w:ind w:left="0" w:firstLine="0"/>
+        <w:jc w:val="both"/>
+        <w:rPr/>
+      </w:pPr>
+      <w:r>
+        <w:rPr>
+          <w:rtl w:val="0"/>
+        </w:rPr>
+        <w:t xml:space="preserve">As conexões extras foram adicionadas entre os switches SW0, SW1 e SW2. </w:t>
+      </w:r>
+    </w:p>
+    <w:p>
+      <w:pPr>
+        <w:ind w:left="0" w:firstLine="0"/>
+        <w:jc w:val="both"/>
+        <w:rPr/>
+      </w:pPr>
+      <w:r>
+        <w:rPr>
+          <w:rtl w:val="0"/>
+        </w:rPr>
+      </w:r>
+    </w:p>
+    <w:p>
+      <w:pPr>
+        <w:ind w:left="0" w:firstLine="0"/>
+        <w:jc w:val="both"/>
+        <w:rPr/>
+      </w:pPr>
+      <w:r>
+        <w:rPr>
+          <w:rtl w:val="0"/>
+        </w:rPr>
+        <w:t xml:space="preserve">SW0 (Fa0/5) -&gt; SW1 (Fa0/8)</w:t>
+      </w:r>
+    </w:p>
+    <w:p>
+      <w:pPr>
+        <w:ind w:left="0" w:firstLine="0"/>
+        <w:jc w:val="both"/>
+        <w:rPr/>
+      </w:pPr>
+      <w:r>
+        <w:rPr>
+          <w:rtl w:val="0"/>
+        </w:rPr>
+        <w:t xml:space="preserve">SW1 (Fa0/9) -&gt; SW2 (Fa0/5) </w:t>
+      </w:r>
+    </w:p>
+    <w:p>
+      <w:pPr>
+        <w:ind w:left="0" w:firstLine="0"/>
+        <w:jc w:val="both"/>
+        <w:rPr/>
+      </w:pPr>
+      <w:r>
+        <w:rPr>
+          <w:rtl w:val="0"/>
+        </w:rPr>
+      </w:r>
+    </w:p>
+    <w:p>
+      <w:pPr>
+        <w:ind w:left="0" w:firstLine="0"/>
+        <w:jc w:val="both"/>
+        <w:rPr/>
+      </w:pPr>
+      <w:r>
+        <w:rPr>
+          <w:b w:val="1"/>
+          <w:bCs w:val="1"/>
+          <w:rtl w:val="0"/>
+        </w:rPr>
+        <w:t xml:space="preserve">Configuração dos switches</w:t>
+      </w:r>
+      <w:r>
+        <w:rPr>
+          <w:rtl w:val="0"/>
+        </w:rPr>
+        <w:t xml:space="preserve"> </w:t>
+      </w:r>
+    </w:p>
+    <w:p>
+      <w:pPr>
+        <w:ind w:left="0" w:firstLine="0"/>
+        <w:jc w:val="both"/>
+        <w:rPr/>
+      </w:pPr>
+      <w:r>
+        <w:rPr>
+          <w:rtl w:val="0"/>
+        </w:rPr>
+      </w:r>
+    </w:p>
+    <w:p>
+      <w:pPr>
+        <w:ind w:left="0" w:firstLine="0"/>
+        <w:jc w:val="both"/>
+        <w:rPr/>
+      </w:pPr>
+      <w:r>
+        <w:rPr>
+          <w:rtl w:val="0"/>
+        </w:rPr>
+        <w:t xml:space="preserve">Em todos os switches</w:t>
+      </w:r>
+    </w:p>
+    <w:p>
+      <w:pPr>
+        <w:ind w:left="0" w:firstLine="0"/>
+        <w:jc w:val="both"/>
+        <w:rPr/>
+      </w:pPr>
+      <w:r>
+        <w:rPr>
+          <w:rtl w:val="0"/>
+        </w:rPr>
+      </w:r>
+    </w:p>
+    <w:p>
+      <w:pPr>
+        <w:ind w:left="0" w:firstLine="0"/>
+        <w:jc w:val="both"/>
+        <w:rPr/>
+      </w:pPr>
+      <w:r>
+        <w:rPr>
+          <w:rtl w:val="0"/>
+        </w:rPr>
+        <w:t xml:space="preserve">enable </w:t>
+      </w:r>
+    </w:p>
+    <w:p>
+      <w:pPr>
+        <w:ind w:left="0" w:firstLine="0"/>
+        <w:jc w:val="both"/>
+        <w:rPr/>
+      </w:pPr>
+      <w:r>
+        <w:rPr>
+          <w:rtl w:val="0"/>
+        </w:rPr>
+        <w:t xml:space="preserve">conf t</w:t>
+      </w:r>
+    </w:p>
+    <w:p>
+      <w:pPr>
+        <w:ind w:left="0" w:firstLine="0"/>
+        <w:jc w:val="both"/>
+        <w:rPr/>
+      </w:pPr>
+      <w:r>
+        <w:rPr>
+          <w:rtl w:val="0"/>
+        </w:rPr>
+      </w:r>
+    </w:p>
+    <w:p>
+      <w:pPr>
+        <w:ind w:left="0" w:firstLine="0"/>
+        <w:jc w:val="both"/>
+        <w:rPr>
+          <w:i w:val="1"/>
+          <w:iCs w:val="1"/>
+        </w:rPr>
+      </w:pPr>
+      <w:r>
+        <w:rPr>
+          <w:i w:val="1"/>
+          <w:iCs w:val="1"/>
+          <w:rtl w:val="0"/>
+        </w:rPr>
+        <w:t xml:space="preserve">Criação das VLANs </w:t>
+      </w:r>
+    </w:p>
+    <w:p>
+      <w:pPr>
+        <w:jc w:val="both"/>
+        <w:rPr/>
+      </w:pPr>
+      <w:r>
+        <w:rPr>
+          <w:rtl w:val="0"/>
+        </w:rPr>
+        <w:t xml:space="preserve">vlan 10</w:t>
+      </w:r>
+    </w:p>
+    <w:p>
+      <w:pPr>
+        <w:jc w:val="both"/>
+        <w:rPr/>
+      </w:pPr>
+      <w:r>
+        <w:rPr>
+          <w:rtl w:val="0"/>
+        </w:rPr>
+        <w:t xml:space="preserve">name LAB</w:t>
+      </w:r>
+    </w:p>
+    <w:p>
+      <w:pPr>
+        <w:jc w:val="both"/>
+        <w:rPr/>
+      </w:pPr>
+      <w:r>
+        <w:rPr>
+          <w:rtl w:val="0"/>
+        </w:rPr>
+        <w:t xml:space="preserve">vlan 20</w:t>
+      </w:r>
+    </w:p>
+    <w:p>
+      <w:pPr>
+        <w:jc w:val="both"/>
+        <w:rPr/>
+      </w:pPr>
+      <w:r>
+        <w:rPr>
+          <w:rtl w:val="0"/>
+        </w:rPr>
+        <w:t xml:space="preserve">name ADM</w:t>
+      </w:r>
+    </w:p>
+    <w:p>
+      <w:pPr>
+        <w:jc w:val="both"/>
+        <w:rPr/>
+      </w:pPr>
+      <w:r>
+        <w:rPr>
+          <w:rtl w:val="0"/>
+        </w:rPr>
+        <w:t xml:space="preserve">vlan 30</w:t>
+      </w:r>
+    </w:p>
+    <w:p>
+      <w:pPr>
+        <w:jc w:val="both"/>
+        <w:rPr/>
+      </w:pPr>
+      <w:r>
+        <w:rPr>
+          <w:rtl w:val="0"/>
+        </w:rPr>
+        <w:t xml:space="preserve">name WIfILAB</w:t>
+      </w:r>
+    </w:p>
+    <w:p>
+      <w:pPr>
+        <w:jc w:val="both"/>
+        <w:rPr/>
+      </w:pPr>
+      <w:r>
+        <w:rPr>
+          <w:rtl w:val="0"/>
+        </w:rPr>
+        <w:t xml:space="preserve">vlan 40</w:t>
+      </w:r>
+    </w:p>
+    <w:p>
+      <w:pPr>
+        <w:jc w:val="both"/>
+        <w:rPr/>
+      </w:pPr>
+      <w:r>
+        <w:rPr>
+          <w:rtl w:val="0"/>
+        </w:rPr>
+        <w:t xml:space="preserve">name WiFiADM</w:t>
+      </w:r>
+    </w:p>
+    <w:p>
+      <w:pPr>
+        <w:jc w:val="both"/>
+        <w:rPr/>
+      </w:pPr>
+      <w:r>
+        <w:rPr>
+          <w:rtl w:val="0"/>
+        </w:rPr>
+        <w:t xml:space="preserve">vlan 58</w:t>
+      </w:r>
+    </w:p>
+    <w:p>
+      <w:pPr>
+        <w:jc w:val="both"/>
+        <w:rPr/>
+      </w:pPr>
+      <w:r>
+        <w:rPr>
+          <w:rtl w:val="0"/>
+        </w:rPr>
+        <w:t xml:space="preserve">name Native</w:t>
+      </w:r>
+    </w:p>
+    <w:p>
+      <w:pPr>
+        <w:jc w:val="both"/>
+        <w:rPr/>
+      </w:pPr>
+      <w:r>
+        <w:rPr>
+          <w:rtl w:val="0"/>
+        </w:rPr>
+        <w:t xml:space="preserve">vlan 100</w:t>
+      </w:r>
+    </w:p>
+    <w:p>
+      <w:pPr>
+        <w:ind w:left="0" w:firstLine="0"/>
+        <w:jc w:val="both"/>
+        <w:rPr/>
+      </w:pPr>
+      <w:r>
+        <w:rPr>
+          <w:rtl w:val="0"/>
+        </w:rPr>
+        <w:t xml:space="preserve">name Gerenciamento</w:t>
+      </w:r>
+    </w:p>
+    <w:p>
+      <w:pPr>
+        <w:ind w:left="0" w:firstLine="0"/>
+        <w:jc w:val="both"/>
+        <w:rPr/>
+      </w:pPr>
+      <w:r>
+        <w:rPr>
+          <w:rtl w:val="0"/>
+        </w:rPr>
+        <w:t xml:space="preserve">vlan 58 </w:t>
+      </w:r>
+    </w:p>
+    <w:p>
+      <w:pPr>
+        <w:ind w:left="0" w:firstLine="0"/>
+        <w:jc w:val="both"/>
+        <w:rPr/>
+      </w:pPr>
+      <w:r>
+        <w:rPr>
+          <w:rtl w:val="0"/>
+        </w:rPr>
+        <w:t xml:space="preserve">name Native </w:t>
+      </w:r>
+    </w:p>
+    <w:p>
+      <w:pPr>
+        <w:ind w:left="0" w:firstLine="0"/>
+        <w:jc w:val="both"/>
+        <w:rPr/>
+      </w:pPr>
+      <w:r>
+        <w:rPr>
+          <w:rtl w:val="0"/>
+        </w:rPr>
+      </w:r>
+    </w:p>
+    <w:p>
+      <w:pPr>
+        <w:ind w:left="0" w:firstLine="0"/>
+        <w:jc w:val="both"/>
+        <w:rPr>
+          <w:i w:val="1"/>
+          <w:iCs w:val="1"/>
+        </w:rPr>
+      </w:pPr>
+      <w:r>
+        <w:rPr>
+          <w:i w:val="1"/>
+          <w:iCs w:val="1"/>
+          <w:rtl w:val="0"/>
+        </w:rPr>
+        <w:t xml:space="preserve">Definição do RSTP</w:t>
+      </w:r>
+    </w:p>
+    <w:p>
+      <w:pPr>
+        <w:ind w:left="0" w:firstLine="0"/>
+        <w:jc w:val="both"/>
+        <w:rPr/>
+      </w:pPr>
+      <w:r>
+        <w:rPr>
+          <w:rtl w:val="0"/>
+        </w:rPr>
+        <w:t xml:space="preserve">spanning-tree mode rapid-pvst </w:t>
+      </w:r>
+    </w:p>
+    <w:p>
+      <w:pPr>
+        <w:ind w:left="0" w:firstLine="0"/>
+        <w:jc w:val="both"/>
+        <w:rPr/>
+      </w:pPr>
+      <w:r>
+        <w:rPr>
+          <w:rtl w:val="0"/>
+        </w:rPr>
+      </w:r>
+    </w:p>
+    <w:p>
+      <w:pPr>
+        <w:ind w:left="0" w:firstLine="0"/>
+        <w:jc w:val="both"/>
+        <w:rPr>
+          <w:i w:val="1"/>
+          <w:iCs w:val="1"/>
+        </w:rPr>
+      </w:pPr>
+      <w:r>
+        <w:rPr>
+          <w:i w:val="1"/>
+          <w:iCs w:val="1"/>
+          <w:rtl w:val="0"/>
+        </w:rPr>
+        <w:t xml:space="preserve">Ativar DHCP Snooping e DAI localmente no switch de acesso</w:t>
+      </w:r>
+    </w:p>
+    <w:p>
+      <w:pPr>
+        <w:ind w:left="0" w:firstLine="0"/>
+        <w:jc w:val="both"/>
+        <w:rPr/>
+      </w:pPr>
+      <w:r>
+        <w:rPr>
+          <w:rtl w:val="0"/>
+        </w:rPr>
+        <w:t xml:space="preserve">ip dhcp snooping </w:t>
+      </w:r>
+    </w:p>
+    <w:p>
+      <w:pPr>
+        <w:ind w:left="0" w:firstLine="0"/>
+        <w:jc w:val="both"/>
+        <w:rPr/>
+      </w:pPr>
+      <w:r>
+        <w:rPr>
+          <w:rtl w:val="0"/>
+        </w:rPr>
+        <w:t xml:space="preserve">ip dhcp snooping vlan 100,10,20,30,40,58</w:t>
+      </w:r>
+    </w:p>
+    <w:p>
+      <w:pPr>
+        <w:ind w:left="0" w:firstLine="0"/>
+        <w:jc w:val="both"/>
+        <w:rPr/>
+      </w:pPr>
+      <w:r>
+        <w:rPr>
+          <w:rtl w:val="0"/>
+        </w:rPr>
+        <w:t xml:space="preserve">no ip dhcp snooping information option </w:t>
+      </w:r>
+    </w:p>
+    <w:p>
+      <w:pPr>
+        <w:ind w:left="0" w:firstLine="0"/>
+        <w:jc w:val="both"/>
+        <w:rPr/>
+      </w:pPr>
+      <w:r>
+        <w:rPr>
+          <w:rtl w:val="0"/>
+        </w:rPr>
+        <w:t xml:space="preserve">ip arp inspection vlan 100,10,20,30,40,58</w:t>
+      </w:r>
+    </w:p>
+    <w:p>
+      <w:pPr>
+        <w:ind w:left="0" w:firstLine="0"/>
+        <w:jc w:val="both"/>
+        <w:rPr/>
+      </w:pPr>
+      <w:r>
+        <w:rPr>
+          <w:rtl w:val="0"/>
+        </w:rPr>
+      </w:r>
+    </w:p>
+    <w:p>
+      <w:pPr>
+        <w:ind w:left="0" w:firstLine="0"/>
+        <w:jc w:val="both"/>
+        <w:rPr>
+          <w:i w:val="1"/>
+          <w:iCs w:val="1"/>
+        </w:rPr>
+      </w:pPr>
+      <w:r>
+        <w:rPr>
+          <w:i w:val="1"/>
+          <w:iCs w:val="1"/>
+          <w:rtl w:val="0"/>
+        </w:rPr>
+        <w:t xml:space="preserve">Configurar as portas de Uplink (que ligam ao SWPrin) como CONFIÁVEIS</w:t>
+      </w:r>
+    </w:p>
+    <w:p>
+      <w:pPr>
+        <w:ind w:left="0" w:firstLine="0"/>
+        <w:jc w:val="both"/>
+        <w:rPr/>
+      </w:pPr>
+      <w:r>
+        <w:rPr>
+          <w:rtl w:val="0"/>
+        </w:rPr>
+        <w:t xml:space="preserve">SW0 (f0/4) | SW1 (f0/3) | SW2 (f0/2)</w:t>
+      </w:r>
+    </w:p>
+    <w:p>
+      <w:pPr>
+        <w:ind w:left="0" w:firstLine="0"/>
+        <w:jc w:val="both"/>
+        <w:rPr/>
+      </w:pPr>
+      <w:r>
+        <w:rPr>
+          <w:rtl w:val="0"/>
+        </w:rPr>
+        <w:t xml:space="preserve">ip dhcp snooping trust </w:t>
+      </w:r>
+    </w:p>
+    <w:p>
+      <w:pPr>
+        <w:ind w:left="0" w:firstLine="0"/>
+        <w:jc w:val="both"/>
+        <w:rPr/>
+      </w:pPr>
+      <w:r>
+        <w:rPr>
+          <w:rtl w:val="0"/>
+        </w:rPr>
+        <w:t xml:space="preserve">ip arp inspection trust</w:t>
+      </w:r>
+    </w:p>
+    <w:p>
+      <w:pPr>
+        <w:ind w:left="0" w:firstLine="0"/>
+        <w:jc w:val="both"/>
+        <w:rPr/>
+      </w:pPr>
+      <w:r>
+        <w:rPr>
+          <w:rtl w:val="0"/>
+        </w:rPr>
+      </w:r>
+    </w:p>
+    <w:p>
+      <w:pPr>
+        <w:ind w:left="0" w:firstLine="0"/>
+        <w:jc w:val="both"/>
+        <w:rPr>
+          <w:i w:val="1"/>
+          <w:iCs w:val="1"/>
+        </w:rPr>
+      </w:pPr>
+      <w:r>
+        <w:rPr>
+          <w:i w:val="1"/>
+          <w:iCs w:val="1"/>
+          <w:rtl w:val="0"/>
+        </w:rPr>
+        <w:t xml:space="preserve">Definição de portas tronco</w:t>
+      </w:r>
+    </w:p>
+    <w:p>
+      <w:pPr>
+        <w:ind w:left="0" w:firstLine="0"/>
+        <w:jc w:val="both"/>
+        <w:rPr/>
+      </w:pPr>
+      <w:r>
+        <w:rPr>
+          <w:rtl w:val="0"/>
+        </w:rPr>
+        <w:t xml:space="preserve">int range f0/</w:t>
+      </w:r>
+    </w:p>
+    <w:p>
+      <w:pPr>
+        <w:ind w:left="0" w:firstLine="0"/>
+        <w:jc w:val="both"/>
+        <w:rPr/>
+      </w:pPr>
+      <w:r>
+        <w:rPr>
+          <w:rtl w:val="0"/>
+        </w:rPr>
+        <w:t xml:space="preserve">sw mode trunk</w:t>
+      </w:r>
+    </w:p>
+    <w:p>
+      <w:pPr>
+        <w:ind w:left="0" w:firstLine="0"/>
+        <w:jc w:val="both"/>
+        <w:rPr/>
+      </w:pPr>
+      <w:r>
+        <w:rPr>
+          <w:rtl w:val="0"/>
+        </w:rPr>
+        <w:t xml:space="preserve">sw trunk native vlan 58</w:t>
+      </w:r>
+    </w:p>
+    <w:p>
+      <w:pPr>
+        <w:ind w:left="0" w:firstLine="0"/>
+        <w:jc w:val="both"/>
+        <w:rPr/>
+      </w:pPr>
+      <w:r>
+        <w:rPr>
+          <w:rtl w:val="0"/>
+        </w:rPr>
+        <w:t xml:space="preserve">sw nonegotiate</w:t>
+      </w:r>
+    </w:p>
+    <w:p>
+      <w:pPr>
+        <w:ind w:left="0" w:firstLine="0"/>
+        <w:jc w:val="both"/>
+        <w:rPr/>
+      </w:pPr>
+      <w:r>
+        <w:rPr>
+          <w:rtl w:val="0"/>
+        </w:rPr>
+      </w:r>
+    </w:p>
+    <w:p>
+      <w:pPr>
+        <w:ind w:left="0" w:firstLine="0"/>
+        <w:jc w:val="both"/>
+        <w:rPr/>
+      </w:pPr>
+      <w:r>
+        <w:rPr>
+          <w:rtl w:val="0"/>
+        </w:rPr>
+        <w:t xml:space="preserve">Configuração das portas de acesso dos PCs</w:t>
+      </w:r>
+    </w:p>
+    <w:p>
+      <w:pPr>
+        <w:ind w:left="0" w:firstLine="0"/>
+        <w:jc w:val="both"/>
+        <w:rPr/>
+      </w:pPr>
+      <w:r>
+        <w:rPr>
+          <w:rtl w:val="0"/>
+        </w:rPr>
+        <w:t xml:space="preserve">SWPrin (f0/6) | SW1 (f0/4 - 7) | SW3 (f0/2 - 5) | SW4 (f0/2 - 5) | SW5 (f0/2 - 4) | SW6 (f0/2 - 4)</w:t>
+      </w:r>
+    </w:p>
+    <w:p>
+      <w:pPr>
+        <w:ind w:left="0" w:firstLine="0"/>
+        <w:jc w:val="both"/>
+        <w:rPr/>
+      </w:pPr>
+      <w:r>
+        <w:rPr>
+          <w:rtl w:val="0"/>
+        </w:rPr>
+        <w:t xml:space="preserve">sw mode access </w:t>
+      </w:r>
+    </w:p>
+    <w:p>
+      <w:pPr>
+        <w:ind w:left="0" w:firstLine="0"/>
+        <w:jc w:val="both"/>
+        <w:rPr/>
+      </w:pPr>
+      <w:r>
+        <w:rPr>
+          <w:rtl w:val="0"/>
+        </w:rPr>
+        <w:t xml:space="preserve">sw port-security</w:t>
+      </w:r>
+    </w:p>
+    <w:p>
+      <w:pPr>
+        <w:ind w:left="0" w:firstLine="0"/>
+        <w:jc w:val="both"/>
+        <w:rPr/>
+      </w:pPr>
+      <w:r>
+        <w:rPr>
+          <w:rtl w:val="0"/>
+        </w:rPr>
+        <w:t xml:space="preserve">sw port-security max 1</w:t>
+      </w:r>
+    </w:p>
+    <w:p>
+      <w:pPr>
+        <w:ind w:left="0" w:firstLine="0"/>
+        <w:jc w:val="both"/>
+        <w:rPr/>
+      </w:pPr>
+      <w:r>
+        <w:rPr>
+          <w:rtl w:val="0"/>
+        </w:rPr>
+        <w:t xml:space="preserve">sw port-security mac-add sticky </w:t>
+      </w:r>
+    </w:p>
+    <w:p>
+      <w:pPr>
+        <w:ind w:left="0" w:firstLine="0"/>
+        <w:jc w:val="both"/>
+        <w:rPr/>
+      </w:pPr>
+      <w:r>
+        <w:rPr>
+          <w:rtl w:val="0"/>
+        </w:rPr>
+        <w:t xml:space="preserve">sw port-security violation shutdown </w:t>
+      </w:r>
+    </w:p>
+    <w:p>
+      <w:pPr>
+        <w:ind w:left="0" w:firstLine="0"/>
+        <w:jc w:val="both"/>
+        <w:rPr/>
+      </w:pPr>
+      <w:r>
+        <w:rPr>
+          <w:rtl w:val="0"/>
+        </w:rPr>
+        <w:t xml:space="preserve">sw nonegotiate</w:t>
+      </w:r>
+    </w:p>
+    <w:p>
+      <w:pPr>
+        <w:ind w:left="0" w:firstLine="0"/>
+        <w:jc w:val="both"/>
+        <w:rPr/>
+      </w:pPr>
+      <w:r>
+        <w:rPr>
+          <w:rtl w:val="0"/>
+        </w:rPr>
+        <w:t xml:space="preserve">spanning-tree portfast</w:t>
+      </w:r>
+    </w:p>
+    <w:p>
+      <w:pPr>
+        <w:ind w:left="0" w:firstLine="0"/>
+        <w:jc w:val="both"/>
+        <w:rPr/>
+      </w:pPr>
+      <w:r>
+        <w:rPr>
+          <w:rtl w:val="0"/>
+        </w:rPr>
+        <w:t xml:space="preserve">spanning-tree bpduguard enable</w:t>
+      </w:r>
+    </w:p>
+    <w:p>
+      <w:pPr>
+        <w:ind w:left="0" w:firstLine="0"/>
+        <w:jc w:val="both"/>
+        <w:rPr/>
+      </w:pPr>
+      <w:r>
+        <w:rPr>
+          <w:rtl w:val="0"/>
+        </w:rPr>
+      </w:r>
+    </w:p>
+    <w:p>
+      <w:pPr>
+        <w:ind w:left="0" w:firstLine="0"/>
+        <w:jc w:val="both"/>
+        <w:rPr/>
+      </w:pPr>
+      <w:r>
+        <w:rPr>
+          <w:rtl w:val="0"/>
+        </w:rPr>
+      </w:r>
+    </w:p>
+    <w:p>
+      <w:pPr>
+        <w:ind w:left="0" w:firstLine="0"/>
+        <w:jc w:val="center"/>
+        <w:rPr/>
+      </w:pPr>
+      <w:r>
+        <w:rPr>
+          <w:b w:val="1"/>
+          <w:bCs w:val="1"/>
+          <w:rtl w:val="0"/>
+        </w:rPr>
+        <w:t xml:space="preserve">SWPrin</w:t>
+      </w:r>
+      <w:r>
+        <w:rPr>
+          <w:rtl w:val="0"/>
+        </w:rPr>
+        <w:t xml:space="preserve"> (esse switch concentra a rede, dessa forma, ele será o nosso root no RSTP e confiável nas mensagens DHCP que vem do roteador ou servidor)</w:t>
+      </w:r>
+    </w:p>
+    <w:p>
+      <w:pPr>
+        <w:ind w:left="0" w:firstLine="0"/>
+        <w:jc w:val="both"/>
+        <w:rPr/>
+      </w:pPr>
+      <w:r>
+        <w:rPr>
+          <w:rtl w:val="0"/>
+        </w:rPr>
+      </w:r>
+    </w:p>
+    <w:p>
+      <w:pPr>
+        <w:ind w:left="0" w:firstLine="0"/>
+        <w:jc w:val="both"/>
+        <w:rPr/>
+      </w:pPr>
+      <w:r>
+        <w:rPr>
+          <w:rtl w:val="0"/>
+        </w:rPr>
+        <w:t xml:space="preserve">Definir as portas trunk </w:t>
+      </w:r>
+    </w:p>
+    <w:p>
+      <w:pPr>
+        <w:jc w:val="both"/>
+        <w:rPr/>
+      </w:pPr>
+      <w:r>
+        <w:rPr>
+          <w:rtl w:val="0"/>
+        </w:rPr>
+        <w:t xml:space="preserve">SWPrin(config)#int range f0/1 - 3, g0/1</w:t>
+      </w:r>
+    </w:p>
+    <w:p>
+      <w:pPr>
+        <w:jc w:val="both"/>
+        <w:rPr/>
+      </w:pPr>
+      <w:r>
+        <w:rPr>
+          <w:rtl w:val="0"/>
+        </w:rPr>
+        <w:t xml:space="preserve">SWPrin(config-if-range)#switchport mode trunk</w:t>
+      </w:r>
+    </w:p>
+    <w:p>
+      <w:pPr>
+        <w:jc w:val="both"/>
+        <w:rPr/>
+      </w:pPr>
+      <w:r>
+        <w:rPr>
+          <w:rtl w:val="0"/>
+        </w:rPr>
+        <w:t xml:space="preserve">SWPrin(config)#switchport trunk native vlan 58</w:t>
+      </w:r>
+    </w:p>
+    <w:p>
+      <w:pPr>
+        <w:jc w:val="both"/>
+        <w:rPr/>
+      </w:pPr>
+      <w:r>
+        <w:rPr>
+          <w:rtl w:val="0"/>
+        </w:rPr>
+        <w:t xml:space="preserve">SWPrin(config)#switchport nonegotiate  </w:t>
+      </w:r>
+    </w:p>
+    <w:p>
+      <w:pPr>
+        <w:ind w:left="0" w:firstLine="0"/>
+        <w:jc w:val="both"/>
+        <w:rPr/>
+      </w:pPr>
+      <w:r>
+        <w:rPr>
+          <w:rtl w:val="0"/>
+        </w:rPr>
+      </w:r>
+    </w:p>
+    <w:p>
+      <w:pPr>
+        <w:ind w:left="0" w:firstLine="0"/>
+        <w:jc w:val="both"/>
+        <w:rPr>
+          <w:i w:val="1"/>
+          <w:iCs w:val="1"/>
+        </w:rPr>
+      </w:pPr>
+      <w:r>
+        <w:rPr>
+          <w:i w:val="1"/>
+          <w:iCs w:val="1"/>
+          <w:rtl w:val="0"/>
+        </w:rPr>
+        <w:t xml:space="preserve">Forçar o switch como root bridge do RSTP </w:t>
+      </w:r>
+    </w:p>
+    <w:p>
+      <w:pPr>
+        <w:jc w:val="both"/>
+        <w:rPr/>
+      </w:pPr>
+      <w:r>
+        <w:rPr>
+          <w:rtl w:val="0"/>
+        </w:rPr>
+        <w:t xml:space="preserve">SWPrin(config)#spanning-tree vlan 1,10,20,30,40,100 root primary</w:t>
+      </w:r>
+    </w:p>
+    <w:p>
+      <w:pPr>
+        <w:jc w:val="both"/>
+        <w:rPr/>
+      </w:pPr>
+      <w:r>
+        <w:rPr>
+          <w:rtl w:val="0"/>
+        </w:rPr>
+      </w:r>
+    </w:p>
+    <w:p>
+      <w:pPr>
+        <w:jc w:val="both"/>
+        <w:rPr>
+          <w:i w:val="1"/>
+          <w:iCs w:val="1"/>
+        </w:rPr>
+      </w:pPr>
+      <w:r>
+        <w:rPr>
+          <w:i w:val="1"/>
+          <w:iCs w:val="1"/>
+          <w:rtl w:val="0"/>
+        </w:rPr>
+        <w:t xml:space="preserve">Ativar o DHCP Snooping Globalmente e nas VLANs</w:t>
+      </w:r>
+    </w:p>
+    <w:p>
+      <w:pPr>
+        <w:jc w:val="both"/>
+        <w:rPr/>
+      </w:pPr>
+      <w:r>
+        <w:rPr>
+          <w:rtl w:val="0"/>
+        </w:rPr>
+        <w:t xml:space="preserve">SWPrin(config)#ip dhcp snooping </w:t>
+      </w:r>
+    </w:p>
+    <w:p>
+      <w:pPr>
+        <w:jc w:val="both"/>
+        <w:rPr/>
+      </w:pPr>
+      <w:r>
+        <w:rPr>
+          <w:rtl w:val="0"/>
+        </w:rPr>
+        <w:t xml:space="preserve">SWPrin(config)#ip dhcp snooping vlan 1,10,20,30,40,100</w:t>
+      </w:r>
+    </w:p>
+    <w:p>
+      <w:pPr>
+        <w:jc w:val="both"/>
+        <w:rPr/>
+      </w:pPr>
+      <w:r>
+        <w:rPr>
+          <w:rtl w:val="0"/>
+        </w:rPr>
+        <w:t xml:space="preserve">SWPrin(config)#no ip dhcp snooping information option</w:t>
+      </w:r>
+    </w:p>
+    <w:p>
+      <w:pPr>
+        <w:jc w:val="both"/>
+        <w:rPr/>
+      </w:pPr>
+      <w:r>
+        <w:rPr>
+          <w:rtl w:val="0"/>
+        </w:rPr>
+      </w:r>
+    </w:p>
+    <w:p>
+      <w:pPr>
+        <w:jc w:val="both"/>
+        <w:rPr>
+          <w:i w:val="1"/>
+          <w:iCs w:val="1"/>
+        </w:rPr>
+      </w:pPr>
+      <w:r>
+        <w:rPr>
+          <w:i w:val="1"/>
+          <w:iCs w:val="1"/>
+          <w:rtl w:val="0"/>
+        </w:rPr>
+        <w:t xml:space="preserve">Definir a porta que vai para o Router0 como CONFIÁVEL para DHCP e ARP</w:t>
+      </w:r>
+    </w:p>
+    <w:p>
+      <w:pPr>
+        <w:jc w:val="both"/>
+        <w:rPr/>
+      </w:pPr>
+      <w:r>
+        <w:rPr>
+          <w:rtl w:val="0"/>
+        </w:rPr>
+        <w:t xml:space="preserve">SWPrin(config)#interface g0/1</w:t>
+      </w:r>
+    </w:p>
+    <w:p>
+      <w:pPr>
+        <w:jc w:val="both"/>
+        <w:rPr/>
+      </w:pPr>
+      <w:r>
+        <w:rPr>
+          <w:rtl w:val="0"/>
+        </w:rPr>
+        <w:t xml:space="preserve">SWPrin(config)#ip dhcp snooping trust</w:t>
+      </w:r>
+    </w:p>
+    <w:p>
+      <w:pPr>
+        <w:jc w:val="both"/>
+        <w:rPr/>
+      </w:pPr>
+      <w:r>
+        <w:rPr>
+          <w:rtl w:val="0"/>
+        </w:rPr>
+        <w:t xml:space="preserve">SWPrin(config)#ip arp inspection trust</w:t>
+      </w:r>
+    </w:p>
+    <w:p>
+      <w:pPr>
+        <w:jc w:val="both"/>
+        <w:rPr/>
+      </w:pPr>
+      <w:r>
+        <w:rPr>
+          <w:rtl w:val="0"/>
+        </w:rPr>
+      </w:r>
+    </w:p>
+    <w:p>
+      <w:pPr>
+        <w:jc w:val="both"/>
+        <w:rPr>
+          <w:i w:val="1"/>
+          <w:iCs w:val="1"/>
+        </w:rPr>
+      </w:pPr>
+      <w:r>
+        <w:rPr>
+          <w:i w:val="1"/>
+          <w:iCs w:val="1"/>
+          <w:rtl w:val="0"/>
+        </w:rPr>
+        <w:t xml:space="preserve">Definir os links que vão para os outros switches (Trunks) também como CONFIÁVEIS</w:t>
+      </w:r>
+    </w:p>
+    <w:p>
+      <w:pPr>
+        <w:jc w:val="both"/>
+        <w:rPr/>
+      </w:pPr>
+      <w:r>
+        <w:rPr>
+          <w:rtl w:val="0"/>
+        </w:rPr>
+        <w:t xml:space="preserve">SWPrin(config)#int range f0/1 - 3</w:t>
+      </w:r>
+    </w:p>
+    <w:p>
+      <w:pPr>
+        <w:jc w:val="both"/>
+        <w:rPr/>
+      </w:pPr>
+      <w:r>
+        <w:rPr>
+          <w:rtl w:val="0"/>
+        </w:rPr>
+        <w:t xml:space="preserve">SWPrin(config-if-range)#ip dhcp snooping trust</w:t>
+      </w:r>
+    </w:p>
+    <w:p>
+      <w:pPr>
+        <w:jc w:val="both"/>
+        <w:rPr/>
+      </w:pPr>
+      <w:r>
+        <w:rPr>
+          <w:rtl w:val="0"/>
+        </w:rPr>
+        <w:t xml:space="preserve">SWPrin(config-if-range)#ip arp inspection trust</w:t>
+      </w:r>
+    </w:p>
+    <w:p>
+      <w:pPr>
+        <w:jc w:val="both"/>
+        <w:rPr/>
+      </w:pPr>
+      <w:r>
+        <w:rPr>
+          <w:rtl w:val="0"/>
+        </w:rPr>
+      </w:r>
+    </w:p>
+    <w:p>
+      <w:pPr>
+        <w:jc w:val="both"/>
+        <w:rPr/>
+      </w:pPr>
+      <w:r>
+        <w:rPr>
+          <w:rtl w:val="0"/>
+        </w:rPr>
+      </w:r>
+    </w:p>
+    <w:p>
+      <w:pPr>
+        <w:jc w:val="both"/>
+        <w:rPr/>
+      </w:pPr>
+      <w:r>
+        <w:rPr>
+          <w:rtl w:val="0"/>
+        </w:rPr>
+      </w:r>
+    </w:p>
+    <w:p>
+      <w:pPr>
+        <w:ind w:left="0" w:firstLine="0"/>
+        <w:jc w:val="both"/>
+        <w:rPr/>
+      </w:pPr>
+      <w:r>
+        <w:rPr>
+          <w:rtl w:val="0"/>
+        </w:rPr>
       </w:r>
     </w:p>
     <w:sectPr>

</xml_diff>